<commit_message>
Fix duplicate Kotlin stdlib classes in Exp 8 and Exp 10 builds
Co-Authored-By: Claude Opus 5.5 <noreply@anthropic.com>
Claude-Session: https://claude.ai/code/session_01QrqifKDkrz1jUjLZW9kUPa
</commit_message>
<xml_diff>
--- a/MAD_Exp8_GoogleMap.docx
+++ b/MAD_Exp8_GoogleMap.docx
@@ -335,6 +335,14 @@
       </w:pPr>
       <w:r>
         <w:t xml:space="preserve">dependencies {</w:t>
+      </w:r>
+    </w:p>
+    <w:p>
+      <w:pPr>
+        <w:spacing w:after="0"/>
+      </w:pPr>
+      <w:r>
+        <w:t xml:space="preserve">    implementation(platform("org.jetbrains.kotlin:kotlin-bom:1.8.22"))</w:t>
       </w:r>
     </w:p>
     <w:p>

</xml_diff>